<commit_message>
Deliver 15-slide course with 97.07 percent full-test accuracy
</commit_message>
<xml_diff>
--- a/docs/学生实验报告模板.docx
+++ b/docs/学生实验报告模板.docx
@@ -102,11 +102,21 @@
       </w:r>
     </w:p>
     <w:p>
+      <w:r>
+        <w:t>6. 官方训练部分有 60,000 张，本实验实际用多少张训练、多少张验证、多少张保留未用？测试图来自哪里？</w:t>
+      </w:r>
+    </w:p>
+    <w:p>
       <w:pPr>
         <w:pStyle w:val="Heading1"/>
       </w:pPr>
       <w:r>
         <w:t>3. 基线实验</w:t>
+      </w:r>
+    </w:p>
+    <w:p>
+      <w:r>
+        <w:t>正式设置：50,000 张训练、1,000 张验证、10,000 张独立测试，8 轮。官方训练部分另有 9,000 张验证池样本保留未用。</w:t>
       </w:r>
     </w:p>
     <w:p>
@@ -215,7 +225,29 @@
           </w:tcPr>
           <w:p>
             <w:r>
-              <w:t>epochs / batch size / learning rate</w:t>
+              <w:t>epochs / batch size / 初始 learning rate</w:t>
+            </w:r>
+          </w:p>
+        </w:tc>
+        <w:tc>
+          <w:tcPr>
+            <w:tcW w:type="dxa" w:w="4320"/>
+          </w:tcPr>
+          <w:p>
+            <w:r>
+              <w:t xml:space="preserve"> </w:t>
+            </w:r>
+          </w:p>
+        </w:tc>
+      </w:tr>
+      <w:tr>
+        <w:tc>
+          <w:tcPr>
+            <w:tcW w:type="dxa" w:w="4320"/>
+          </w:tcPr>
+          <w:p>
+            <w:r>
+              <w:t>学习率衰减轮次 / 倍率（默认 4、6 / 0.2）</w:t>
             </w:r>
           </w:p>
         </w:tc>
@@ -379,12 +411,12 @@
         <w:pStyle w:val="Heading1"/>
       </w:pPr>
       <w:r>
-        <w:t>4. 单参数对比：3 轮与 5 轮</w:t>
+        <w:t>4. 单参数对比：8 轮与 10 轮</w:t>
       </w:r>
     </w:p>
     <w:p>
       <w:r>
-        <w:t>两次实验均从同一官方预训练权重开始，样本、随机种子、批次大小和学习率保持相同。只改变总训练轮数，并分别保存结果。</w:t>
+        <w:t>两次实验均从同一官方预训练权重开始，样本、随机种子、批次大小、初始学习率和衰减设置保持相同。只改变总训练轮数，并分别保存结果。</w:t>
       </w:r>
     </w:p>
     <w:p>
@@ -425,7 +457,7 @@
           </w:tcPr>
           <w:p>
             <w:r>
-              <w:t>基线：3 轮</w:t>
+              <w:t>基线：8 轮</w:t>
             </w:r>
           </w:p>
         </w:tc>
@@ -436,7 +468,7 @@
           </w:tcPr>
           <w:p>
             <w:r>
-              <w:t>对比：5 轮</w:t>
+              <w:t>对比：10 轮</w:t>
             </w:r>
           </w:p>
         </w:tc>
@@ -512,7 +544,39 @@
           </w:tcPr>
           <w:p>
             <w:r>
-              <w:t>batch size / learning rate</w:t>
+              <w:t>batch size / 初始 learning rate</w:t>
+            </w:r>
+          </w:p>
+        </w:tc>
+        <w:tc>
+          <w:tcPr>
+            <w:tcW w:type="dxa" w:w="2880"/>
+          </w:tcPr>
+          <w:p>
+            <w:r>
+              <w:t xml:space="preserve"> </w:t>
+            </w:r>
+          </w:p>
+        </w:tc>
+        <w:tc>
+          <w:tcPr>
+            <w:tcW w:type="dxa" w:w="2880"/>
+          </w:tcPr>
+          <w:p>
+            <w:r>
+              <w:t xml:space="preserve"> </w:t>
+            </w:r>
+          </w:p>
+        </w:tc>
+      </w:tr>
+      <w:tr>
+        <w:tc>
+          <w:tcPr>
+            <w:tcW w:type="dxa" w:w="2880"/>
+          </w:tcPr>
+          <w:p>
+            <w:r>
+              <w:t>学习率衰减轮次 / 倍率</w:t>
             </w:r>
           </w:p>
         </w:tc>
@@ -706,7 +770,7 @@
     </w:p>
     <w:p>
       <w:r>
-        <w:t>• 根据验证集，训练 5 轮是否比 3 轮更好？用具体数据说明：</w:t>
+        <w:t>• 根据验证集，训练 10 轮是否比 8 轮更好？用具体数据说明：</w:t>
       </w:r>
     </w:p>
     <w:p>
@@ -726,7 +790,7 @@
     </w:p>
     <w:p>
       <w:r>
-        <w:t>仅完成 CPU 快速路线的同学：明确标注本节未完成，并说明已经运行的实际参数。不要把 1 轮 CPU 结果改写成 3 轮基线结果。</w:t>
+        <w:t>仅完成 CPU 快速路线的同学：明确标注本节未完成，并说明已经运行的实际参数。不要把 1 轮 CPU 结果改写成 8 轮基线结果。</w:t>
       </w:r>
     </w:p>
     <w:p>

</xml_diff>

<commit_message>
Let students choose epoch counts and remove repeated slide footer
</commit_message>
<xml_diff>
--- a/docs/学生实验报告模板.docx
+++ b/docs/学生实验报告模板.docx
@@ -116,7 +116,7 @@
     </w:p>
     <w:p>
       <w:r>
-        <w:t>正式设置：50,000 张训练、1,000 张验证、10,000 张独立测试，8 轮。官方训练部分另有 9,000 张验证池样本保留未用。</w:t>
+        <w:t>正式设置：50,000 张训练、1,000 张验证、10,000 张独立测试；训练轮数自行设置并记录。官方训练部分另有 9,000 张验证池样本保留未用。</w:t>
       </w:r>
     </w:p>
     <w:p>
@@ -411,7 +411,7 @@
         <w:pStyle w:val="Heading1"/>
       </w:pPr>
       <w:r>
-        <w:t>4. 单参数对比：8 轮与 10 轮</w:t>
+        <w:t>4. 自选训练轮数的对比</w:t>
       </w:r>
     </w:p>
     <w:p>
@@ -457,7 +457,7 @@
           </w:tcPr>
           <w:p>
             <w:r>
-              <w:t>基线：8 轮</w:t>
+              <w:t>基线实验</w:t>
             </w:r>
           </w:p>
         </w:tc>
@@ -468,7 +468,39 @@
           </w:tcPr>
           <w:p>
             <w:r>
-              <w:t>对比：10 轮</w:t>
+              <w:t>自选对比实验</w:t>
+            </w:r>
+          </w:p>
+        </w:tc>
+      </w:tr>
+      <w:tr>
+        <w:tc>
+          <w:tcPr>
+            <w:tcW w:type="dxa" w:w="2880"/>
+          </w:tcPr>
+          <w:p>
+            <w:r>
+              <w:t>实际训练轮数</w:t>
+            </w:r>
+          </w:p>
+        </w:tc>
+        <w:tc>
+          <w:tcPr>
+            <w:tcW w:type="dxa" w:w="2880"/>
+          </w:tcPr>
+          <w:p>
+            <w:r>
+              <w:t xml:space="preserve"> </w:t>
+            </w:r>
+          </w:p>
+        </w:tc>
+        <w:tc>
+          <w:tcPr>
+            <w:tcW w:type="dxa" w:w="2880"/>
+          </w:tcPr>
+          <w:p>
+            <w:r>
+              <w:t xml:space="preserve"> </w:t>
             </w:r>
           </w:p>
         </w:tc>
@@ -770,7 +802,7 @@
     </w:p>
     <w:p>
       <w:r>
-        <w:t>• 根据验证集，训练 10 轮是否比 8 轮更好？用具体数据说明：</w:t>
+        <w:t>• 根据验证集，另一设置是否改善了结果？用具体数据说明：</w:t>
       </w:r>
     </w:p>
     <w:p>
@@ -790,7 +822,7 @@
     </w:p>
     <w:p>
       <w:r>
-        <w:t>仅完成 CPU 快速路线的同学：明确标注本节未完成，并说明已经运行的实际参数。不要把 1 轮 CPU 结果改写成 8 轮基线结果。</w:t>
+        <w:t>仅完成 CPU 快速路线的同学：明确标注本节未完成，并说明已经运行的实际参数。不要把 1 轮 CPU 结果改写成 完整基线结果。</w:t>
       </w:r>
     </w:p>
     <w:p>

</xml_diff>

<commit_message>
Let students choose batch size alongside training epochs
</commit_message>
<xml_diff>
--- a/docs/学生实验报告模板.docx
+++ b/docs/学生实验报告模板.docx
@@ -116,7 +116,7 @@
     </w:p>
     <w:p>
       <w:r>
-        <w:t>正式设置：50,000 张训练、1,000 张验证、10,000 张独立测试；训练轮数自行设置并记录。官方训练部分另有 9,000 张验证池样本保留未用。</w:t>
+        <w:t>正式设置：50,000 张训练、1,000 张验证、10,000 张独立测试；训练轮数和 batch size 自行设置并记录。官方训练部分另有 9,000 张验证池样本保留未用。</w:t>
       </w:r>
     </w:p>
     <w:p>
@@ -411,12 +411,12 @@
         <w:pStyle w:val="Heading1"/>
       </w:pPr>
       <w:r>
-        <w:t>4. 自选训练轮数的对比</w:t>
+        <w:t>4. 自选训练参数的对比</w:t>
       </w:r>
     </w:p>
     <w:p>
       <w:r>
-        <w:t>两次实验均从同一官方预训练权重开始，样本、随机种子、批次大小、初始学习率和衰减设置保持相同。只改变总训练轮数，并分别保存结果。</w:t>
+        <w:t>训练轮数和 batch size 均自行设置，记录具体数值与选择依据。建议一次只改变其中一项；保持数据划分、随机种子、预训练来源和学习率策略相同。分别保存结果；如果两项都变了，说明比较的局限。</w:t>
       </w:r>
     </w:p>
     <w:p>
@@ -807,7 +807,7 @@
     </w:p>
     <w:p>
       <w:r>
-        <w:t>• 多训练几轮有什么收益或代价？</w:t>
+        <w:t>• 调整所选参数有什么收益或代价？</w:t>
       </w:r>
     </w:p>
     <w:p>
@@ -817,7 +817,7 @@
     </w:p>
     <w:p>
       <w:r>
-        <w:t>• 两次设置是否完全一致？如果调整过 batch size 或样本数，说明原因及其对比较的影响：</w:t>
+        <w:t>• 两次改变了哪些参数？为什么这样设置？如果多项同时改变，如何影响比较：</w:t>
       </w:r>
     </w:p>
     <w:p>

</xml_diff>

<commit_message>
Set course identity and contacts and simplify teaching materials
</commit_message>
<xml_diff>
--- a/docs/学生实验报告模板.docx
+++ b/docs/学生实验报告模板.docx
@@ -7,12 +7,12 @@
         <w:pStyle w:val="Title"/>
       </w:pPr>
       <w:r>
-        <w:t>ByteFormer 微调 MNIST 实验报告</w:t>
+        <w:t>码流图像分类实验报告</w:t>
       </w:r>
     </w:p>
     <w:p>
       <w:r>
-        <w:t>请填写自己的真实运行记录。无法完成的部分写明原因，不要用教师截图或同学结果代替。</w:t>
+        <w:t>根据实验记录填写参数、指标和分析，并附相关结果文件。</w:t>
       </w:r>
     </w:p>
     <w:p>
@@ -68,7 +68,7 @@
         <w:pStyle w:val="Heading1"/>
       </w:pPr>
       <w:r>
-        <w:t>2. 我理解的实验</w:t>
+        <w:t>2. 实验原理</w:t>
       </w:r>
     </w:p>
     <w:p>
@@ -116,7 +116,7 @@
     </w:p>
     <w:p>
       <w:r>
-        <w:t>正式设置：50,000 张训练、1,000 张验证、10,000 张独立测试；训练轮数和 batch size 自行设置并记录。官方训练部分另有 9,000 张验证池样本保留未用。</w:t>
+        <w:t>数据设置：50,000 张训练、1,000 张验证、10,000 张独立测试；训练轮数和 batch size 自行设置并记录。官方训练部分另有 9,000 张验证池样本保留未用。</w:t>
       </w:r>
     </w:p>
     <w:p>
@@ -129,7 +129,7 @@
     </w:p>
     <w:p>
       <w:r>
-        <w:t>把自己真正执行的训练命令粘贴到这里：</w:t>
+        <w:t>填写训练命令：</w:t>
       </w:r>
     </w:p>
     <w:p>
@@ -137,7 +137,7 @@
         <w:pStyle w:val="Title"/>
       </w:pPr>
       <w:r>
-        <w:t>粘贴命令，不要把本行当作实验记录。</w:t>
+        <w:t>填写训练命令</w:t>
       </w:r>
     </w:p>
     <w:tbl>
@@ -822,7 +822,7 @@
     </w:p>
     <w:p>
       <w:r>
-        <w:t>仅完成 CPU 快速路线的同学：明确标注本节未完成，并说明已经运行的实际参数。不要把 1 轮 CPU 结果改写成 完整基线结果。</w:t>
+        <w:t>如仅完成部分实验，请说明已完成的内容与后续计划。</w:t>
       </w:r>
     </w:p>
     <w:p>
@@ -870,7 +870,7 @@
     </w:p>
     <w:p>
       <w:r>
-        <w:t>如果没有找到错误，请真实说明查找范围，并分析一个容易混淆的样本；不要伪造预测。</w:t>
+        <w:t>若没有找到错例，说明查找范围，并分析一个容易混淆的样本。</w:t>
       </w:r>
     </w:p>
     <w:p>
@@ -1017,7 +1017,7 @@
       <w:pStyle w:val="Footer"/>
     </w:pPr>
     <w:r>
-      <w:t>ByteFormer · MNIST 课程实验 | 填写自己的真实结果</w:t>
+      <w:t>码流图像分类实验报告</w:t>
     </w:r>
   </w:p>
 </w:ftr>

</xml_diff>

<commit_message>
Revise course deck and corrupted-stream bonus task
</commit_message>
<xml_diff>
--- a/docs/学生实验报告模板.docx
+++ b/docs/学生实验报告模板.docx
@@ -103,7 +103,7 @@
     </w:p>
     <w:p>
       <w:r>
-        <w:t>6. 官方训练部分有 60,000 张，本实验实际用多少张训练、多少张验证、多少张保留未用？测试图来自哪里？</w:t>
+        <w:t>6. 本实验实际使用多少张训练、验证和测试图？三类数据分别怎样使用？</w:t>
       </w:r>
     </w:p>
     <w:p>
@@ -116,7 +116,7 @@
     </w:p>
     <w:p>
       <w:r>
-        <w:t>数据设置：50,000 张训练、1,000 张验证、10,000 张独立测试；训练轮数和 batch size 自行设置并记录。官方训练部分另有 9,000 张验证池样本保留未用。</w:t>
+        <w:t>数据设置：5,000 张训练、1,000 张验证、1,000 张独立测试，每个类别数量相同；训练轮数和 batch size 自行设置并记录。</w:t>
       </w:r>
     </w:p>
     <w:p>
@@ -247,7 +247,7 @@
           </w:tcPr>
           <w:p>
             <w:r>
-              <w:t>学习率衰减轮次 / 倍率（默认 4、6 / 0.2）</w:t>
+              <w:t>学习率及调整设置</w:t>
             </w:r>
           </w:p>
         </w:tc>
@@ -398,7 +398,7 @@
     <w:p/>
     <w:p>
       <w:r>
-        <w:t>请插入 curves.png、predictions.png 和 confusion_matrix.png，或者给出所附文件名。</w:t>
+        <w:t>请插入 curves.png、测试结果图和单图预测结果，或者给出所附文件名。</w:t>
       </w:r>
     </w:p>
     <w:p>
@@ -608,7 +608,7 @@
           </w:tcPr>
           <w:p>
             <w:r>
-              <w:t>学习率衰减轮次 / 倍率</w:t>
+              <w:t>学习率及调整设置</w:t>
             </w:r>
           </w:p>
         </w:tc>
@@ -878,7 +878,35 @@
         <w:pStyle w:val="Heading1"/>
       </w:pPr>
       <w:r>
-        <w:t>6. 问题与解决</w:t>
+        <w:t>6. 加分项（选做）</w:t>
+      </w:r>
+    </w:p>
+    <w:p>
+      <w:r>
+        <w:t>若完成损坏码流分类，请填写 Clean、Medium-Flip、Medium-Loss、Medium-Mixed 四类结果，并说明 bit flip 与 byte loss 的区别、所用改进方法及其效果。</w:t>
+      </w:r>
+    </w:p>
+    <w:p>
+      <w:r>
+        <w:t>Clean：　　　　Medium-Flip：　　　　Medium-Loss：　　　　Medium-Mixed：</w:t>
+      </w:r>
+    </w:p>
+    <w:p>
+      <w:r>
+        <w:t>改进方法：损坏增强 / 一致性约束 / 特征对齐 / 其他（写明）：</w:t>
+      </w:r>
+    </w:p>
+    <w:p>
+      <w:r>
+        <w:t>改进前后结果比较与分析：</w:t>
+      </w:r>
+    </w:p>
+    <w:p>
+      <w:pPr>
+        <w:pStyle w:val="Heading1"/>
+      </w:pPr>
+      <w:r>
+        <w:t>7. 问题与解决</w:t>
       </w:r>
     </w:p>
     <w:tbl>
@@ -966,7 +994,7 @@
         <w:pStyle w:val="Heading1"/>
       </w:pPr>
       <w:r>
-        <w:t>7. 提交检查</w:t>
+        <w:t>8. 提交检查</w:t>
       </w:r>
     </w:p>
     <w:p>
@@ -986,7 +1014,7 @@
     </w:p>
     <w:p>
       <w:r>
-        <w:t>□ 附上要求的曲线、预测图、混淆矩阵和错例证据。</w:t>
+        <w:t>□ 附上要求的曲线、测试结果、预测图和错例证据。</w:t>
       </w:r>
     </w:p>
     <w:p>

</xml_diff>